<commit_message>
docs: add official EAS build link to README and project document
</commit_message>
<xml_diff>
--- a/PitchCraft_Project_Document.docx
+++ b/PitchCraft_Project_Document.docx
@@ -6198,17 +6198,34 @@
                 <w:color w:val="212529"/>
                 <w:sz w:val="19"/>
               </w:rPr>
-              <w:t>npm install -g eas-cli</w:t>
-              <w:br/>
-              <w:t>eas login</w:t>
-              <w:br/>
-              <w:t>eas build --platform android --profile preview</w:t>
+              <w:t>npx eas-cli build --platform android --profile preview</w:t>
             </w:r>
           </w:p>
         </w:tc>
       </w:tr>
     </w:tbl>
     <w:p/>
+    <w:p>
+      <w:pPr>
+        <w:spacing w:before="40" w:after="80"/>
+      </w:pPr>
+      <w:r/>
+      <w:r>
+        <w:rPr>
+          <w:b/>
+        </w:rPr>
+        <w:t>Official Expo Build &amp; APK Download:</w:t>
+      </w:r>
+      <w:r/>
+    </w:p>
+    <w:p>
+      <w:pPr>
+        <w:spacing w:before="40" w:after="80"/>
+      </w:pPr>
+      <w:r>
+        <w:t>`https://expo.dev/accounts/akagra1/projects/PitchCraft/builds/667ca20d-62eb-4dee-ac80-7569ec4db8c1`</w:t>
+      </w:r>
+    </w:p>
     <w:p>
       <w:pPr>
         <w:spacing w:before="160" w:after="160"/>

</xml_diff>